<commit_message>
Implement manual capture frame to file and adding a dummy row
</commit_message>
<xml_diff>
--- a/Python/Magic/Magic Card Scanner.docx
+++ b/Python/Magic/Magic Card Scanner.docx
@@ -14,23 +14,7 @@
           <w:b/>
           <w:bCs/>
         </w:rPr>
-        <w:t xml:space="preserve">Magic Card Scanner — Implementation Plan (Python + </w:t>
-      </w:r>
-      <w:proofErr w:type="spellStart"/>
-      <w:r>
-        <w:rPr>
-          <w:b/>
-          <w:bCs/>
-        </w:rPr>
-        <w:t>Scryfall</w:t>
-      </w:r>
-      <w:proofErr w:type="spellEnd"/>
-      <w:r>
-        <w:rPr>
-          <w:b/>
-          <w:bCs/>
-        </w:rPr>
-        <w:t xml:space="preserve"> + SQLite)</w:t>
+        <w:t>Magic Card Scanner — Implementation Plan (Python + Scryfall + SQLite)</w:t>
       </w:r>
     </w:p>
     <w:p>
@@ -175,13 +159,8 @@
         <w:t>Capture</w:t>
       </w:r>
       <w:r>
-        <w:t xml:space="preserve">: camera selection, live preview, take </w:t>
-      </w:r>
-      <w:proofErr w:type="gramStart"/>
-      <w:r>
-        <w:t>snapshot</w:t>
-      </w:r>
-      <w:proofErr w:type="gramEnd"/>
+        <w:t>: camera selection, live preview, take snapshot</w:t>
+      </w:r>
     </w:p>
     <w:p>
       <w:pPr>
@@ -271,7 +250,6 @@
       <w:r>
         <w:t xml:space="preserve">Use </w:t>
       </w:r>
-      <w:proofErr w:type="spellStart"/>
       <w:r>
         <w:rPr>
           <w:b/>
@@ -279,7 +257,6 @@
         </w:rPr>
         <w:t>Scryfall</w:t>
       </w:r>
-      <w:proofErr w:type="spellEnd"/>
       <w:r>
         <w:t xml:space="preserve"> to resolve final card record</w:t>
       </w:r>
@@ -387,13 +364,8 @@
           <w:numId w:val="3"/>
         </w:numPr>
       </w:pPr>
-      <w:proofErr w:type="spellStart"/>
-      <w:r>
-        <w:t>opencv</w:t>
-      </w:r>
-      <w:proofErr w:type="spellEnd"/>
-      <w:r>
-        <w:t>-python — camera + image processing</w:t>
+      <w:r>
+        <w:t>opencv-python — camera + image processing</w:t>
       </w:r>
     </w:p>
     <w:p>
@@ -403,11 +375,9 @@
           <w:numId w:val="3"/>
         </w:numPr>
       </w:pPr>
-      <w:proofErr w:type="spellStart"/>
       <w:r>
         <w:t>numpy</w:t>
       </w:r>
-      <w:proofErr w:type="spellEnd"/>
     </w:p>
     <w:p>
       <w:pPr>
@@ -417,15 +387,7 @@
         </w:numPr>
       </w:pPr>
       <w:r>
-        <w:t xml:space="preserve">requests — </w:t>
-      </w:r>
-      <w:proofErr w:type="spellStart"/>
-      <w:r>
-        <w:t>Scryfall</w:t>
-      </w:r>
-      <w:proofErr w:type="spellEnd"/>
-      <w:r>
-        <w:t xml:space="preserve"> API calls</w:t>
+        <w:t>requests — Scryfall API calls</w:t>
       </w:r>
     </w:p>
     <w:p>
@@ -507,15 +469,7 @@
         </w:numPr>
       </w:pPr>
       <w:r>
-        <w:t xml:space="preserve">Option A (local, easy): </w:t>
-      </w:r>
-      <w:proofErr w:type="spellStart"/>
-      <w:r>
-        <w:t>imagehash</w:t>
-      </w:r>
-      <w:proofErr w:type="spellEnd"/>
-      <w:r>
-        <w:t xml:space="preserve"> (perceptual hash) + strong preprocessing</w:t>
+        <w:t>Option A (local, easy): imagehash (perceptual hash) + strong preprocessing</w:t>
       </w:r>
     </w:p>
     <w:p>
@@ -526,15 +480,7 @@
         </w:numPr>
       </w:pPr>
       <w:r>
-        <w:t xml:space="preserve">Option B (stronger): </w:t>
-      </w:r>
-      <w:proofErr w:type="spellStart"/>
-      <w:r>
-        <w:t>onnxruntime</w:t>
-      </w:r>
-      <w:proofErr w:type="spellEnd"/>
-      <w:r>
-        <w:t xml:space="preserve"> + a lightweight vision embedding model (CLIP-like)</w:t>
+        <w:t>Option B (stronger): onnxruntime + a lightweight vision embedding model (CLIP-like)</w:t>
       </w:r>
     </w:p>
     <w:p>
@@ -555,21 +501,8 @@
           <w:numId w:val="4"/>
         </w:numPr>
       </w:pPr>
-      <w:proofErr w:type="spellStart"/>
-      <w:r>
-        <w:t>easyocr</w:t>
-      </w:r>
-      <w:proofErr w:type="spellEnd"/>
-      <w:r>
-        <w:t xml:space="preserve"> (good dev experience) OR </w:t>
-      </w:r>
-      <w:proofErr w:type="spellStart"/>
-      <w:r>
-        <w:t>pytesseract</w:t>
-      </w:r>
-      <w:proofErr w:type="spellEnd"/>
-      <w:r>
-        <w:t xml:space="preserve"> (lighter runtime)</w:t>
+      <w:r>
+        <w:t>easyocr (good dev experience) OR pytesseract (lighter runtime)</w:t>
       </w:r>
     </w:p>
     <w:p>
@@ -594,11 +527,9 @@
           <w:numId w:val="5"/>
         </w:numPr>
       </w:pPr>
-      <w:proofErr w:type="gramStart"/>
       <w:r>
         <w:t>pandas</w:t>
       </w:r>
-      <w:proofErr w:type="gramEnd"/>
     </w:p>
     <w:p>
       <w:pPr>
@@ -607,13 +538,8 @@
           <w:numId w:val="5"/>
         </w:numPr>
       </w:pPr>
-      <w:proofErr w:type="spellStart"/>
-      <w:r>
-        <w:t>openpyxl</w:t>
-      </w:r>
-      <w:proofErr w:type="spellEnd"/>
-      <w:r>
-        <w:t xml:space="preserve"> (XLSX writing)</w:t>
+      <w:r>
+        <w:t>openpyxl (XLSX writing)</w:t>
       </w:r>
     </w:p>
     <w:p>
@@ -638,13 +564,8 @@
           <w:numId w:val="6"/>
         </w:numPr>
       </w:pPr>
-      <w:proofErr w:type="spellStart"/>
-      <w:r>
-        <w:t>rapidfuzz</w:t>
-      </w:r>
-      <w:proofErr w:type="spellEnd"/>
-      <w:r>
-        <w:t xml:space="preserve"> — fuzzy name matching if OCR is imperfect</w:t>
+      <w:r>
+        <w:t>rapidfuzz — fuzzy name matching if OCR is imperfect</w:t>
       </w:r>
     </w:p>
     <w:p>
@@ -654,21 +575,8 @@
           <w:numId w:val="6"/>
         </w:numPr>
       </w:pPr>
-      <w:proofErr w:type="spellStart"/>
-      <w:r>
-        <w:t>diskcache</w:t>
-      </w:r>
-      <w:proofErr w:type="spellEnd"/>
-      <w:r>
-        <w:t xml:space="preserve"> or a simple SQLite cache table — avoid repeated </w:t>
-      </w:r>
-      <w:proofErr w:type="spellStart"/>
-      <w:r>
-        <w:t>Scryfall</w:t>
-      </w:r>
-      <w:proofErr w:type="spellEnd"/>
-      <w:r>
-        <w:t xml:space="preserve"> queries</w:t>
+      <w:r>
+        <w:t>diskcache or a simple SQLite cache table — avoid repeated Scryfall queries</w:t>
       </w:r>
     </w:p>
     <w:p>
@@ -751,11 +659,9 @@
           <w:numId w:val="7"/>
         </w:numPr>
       </w:pPr>
-      <w:proofErr w:type="spellStart"/>
       <w:r>
         <w:t>created_at</w:t>
       </w:r>
-      <w:proofErr w:type="spellEnd"/>
     </w:p>
     <w:p>
       <w:r>
@@ -766,15 +672,7 @@
         <w:t>cards</w:t>
       </w:r>
       <w:r>
-        <w:t xml:space="preserve"> (cached canonical card printing data from </w:t>
-      </w:r>
-      <w:proofErr w:type="spellStart"/>
-      <w:r>
-        <w:t>Scryfall</w:t>
-      </w:r>
-      <w:proofErr w:type="spellEnd"/>
-      <w:r>
-        <w:t>)</w:t>
+        <w:t xml:space="preserve"> (cached canonical card printing data from Scryfall)</w:t>
       </w:r>
     </w:p>
     <w:p>
@@ -795,14 +693,9 @@
           <w:numId w:val="8"/>
         </w:numPr>
       </w:pPr>
-      <w:proofErr w:type="spellStart"/>
       <w:r>
         <w:lastRenderedPageBreak/>
-        <w:t>scryfall_id</w:t>
-      </w:r>
-      <w:proofErr w:type="spellEnd"/>
-      <w:r>
-        <w:t xml:space="preserve"> (unique)</w:t>
+        <w:t>scryfall_id (unique)</w:t>
       </w:r>
     </w:p>
     <w:p>
@@ -823,11 +716,9 @@
           <w:numId w:val="8"/>
         </w:numPr>
       </w:pPr>
-      <w:proofErr w:type="spellStart"/>
       <w:r>
         <w:t>set_code</w:t>
       </w:r>
-      <w:proofErr w:type="spellEnd"/>
     </w:p>
     <w:p>
       <w:pPr>
@@ -836,11 +727,9 @@
           <w:numId w:val="8"/>
         </w:numPr>
       </w:pPr>
-      <w:proofErr w:type="spellStart"/>
       <w:r>
         <w:t>collector_number</w:t>
       </w:r>
-      <w:proofErr w:type="spellEnd"/>
     </w:p>
     <w:p>
       <w:pPr>
@@ -882,11 +771,9 @@
           <w:numId w:val="8"/>
         </w:numPr>
       </w:pPr>
-      <w:proofErr w:type="spellStart"/>
       <w:r>
         <w:t>image_uri_normal</w:t>
       </w:r>
-      <w:proofErr w:type="spellEnd"/>
     </w:p>
     <w:p>
       <w:pPr>
@@ -895,13 +782,8 @@
           <w:numId w:val="8"/>
         </w:numPr>
       </w:pPr>
-      <w:proofErr w:type="spellStart"/>
-      <w:r>
-        <w:t>oracle_id</w:t>
-      </w:r>
-      <w:proofErr w:type="spellEnd"/>
-      <w:r>
-        <w:t xml:space="preserve"> (optional)</w:t>
+      <w:r>
+        <w:t>oracle_id (optional)</w:t>
       </w:r>
     </w:p>
     <w:p>
@@ -911,14 +793,11 @@
           <w:numId w:val="8"/>
         </w:numPr>
       </w:pPr>
-      <w:proofErr w:type="spellStart"/>
       <w:r>
         <w:t>last_fetched_at</w:t>
       </w:r>
-      <w:proofErr w:type="spellEnd"/>
-    </w:p>
-    <w:p>
-      <w:proofErr w:type="spellStart"/>
+    </w:p>
+    <w:p>
       <w:r>
         <w:rPr>
           <w:b/>
@@ -926,7 +805,6 @@
         </w:rPr>
         <w:t>collection_entries</w:t>
       </w:r>
-      <w:proofErr w:type="spellEnd"/>
     </w:p>
     <w:p>
       <w:pPr>
@@ -946,13 +824,8 @@
           <w:numId w:val="9"/>
         </w:numPr>
       </w:pPr>
-      <w:proofErr w:type="spellStart"/>
-      <w:r>
-        <w:t>collection_id</w:t>
-      </w:r>
-      <w:proofErr w:type="spellEnd"/>
-      <w:r>
-        <w:t xml:space="preserve"> (FK)</w:t>
+      <w:r>
+        <w:t>collection_id (FK)</w:t>
       </w:r>
     </w:p>
     <w:p>
@@ -962,13 +835,8 @@
           <w:numId w:val="9"/>
         </w:numPr>
       </w:pPr>
-      <w:proofErr w:type="spellStart"/>
-      <w:r>
-        <w:t>card_id</w:t>
-      </w:r>
-      <w:proofErr w:type="spellEnd"/>
-      <w:r>
-        <w:t xml:space="preserve"> (FK)</w:t>
+      <w:r>
+        <w:t>card_id (FK)</w:t>
       </w:r>
     </w:p>
     <w:p>
@@ -989,13 +857,8 @@
           <w:numId w:val="9"/>
         </w:numPr>
       </w:pPr>
-      <w:proofErr w:type="spellStart"/>
-      <w:r>
-        <w:t>is_foil</w:t>
-      </w:r>
-      <w:proofErr w:type="spellEnd"/>
-      <w:r>
-        <w:t xml:space="preserve"> (bool)</w:t>
+      <w:r>
+        <w:t>is_foil (bool)</w:t>
       </w:r>
     </w:p>
     <w:p>
@@ -1027,11 +890,9 @@
           <w:numId w:val="9"/>
         </w:numPr>
       </w:pPr>
-      <w:proofErr w:type="spellStart"/>
       <w:r>
         <w:t>added_at</w:t>
       </w:r>
-      <w:proofErr w:type="spellEnd"/>
     </w:p>
     <w:p>
       <w:pPr>
@@ -1067,31 +928,7 @@
         </w:numPr>
       </w:pPr>
       <w:r>
-        <w:t>(</w:t>
-      </w:r>
-      <w:proofErr w:type="spellStart"/>
-      <w:r>
-        <w:t>collection_id</w:t>
-      </w:r>
-      <w:proofErr w:type="spellEnd"/>
-      <w:r>
-        <w:t xml:space="preserve">, </w:t>
-      </w:r>
-      <w:proofErr w:type="spellStart"/>
-      <w:r>
-        <w:t>card_id</w:t>
-      </w:r>
-      <w:proofErr w:type="spellEnd"/>
-      <w:r>
-        <w:t xml:space="preserve">, </w:t>
-      </w:r>
-      <w:proofErr w:type="spellStart"/>
-      <w:r>
-        <w:t>is_foil</w:t>
-      </w:r>
-      <w:proofErr w:type="spellEnd"/>
-      <w:r>
-        <w:t>, condition)</w:t>
+        <w:t>(collection_id, card_id, is_foil, condition)</w:t>
       </w:r>
     </w:p>
     <w:p>
@@ -1186,15 +1023,7 @@
         </w:numPr>
       </w:pPr>
       <w:r>
-        <w:t xml:space="preserve">Edge </w:t>
-      </w:r>
-      <w:proofErr w:type="gramStart"/>
-      <w:r>
-        <w:t>detect</w:t>
-      </w:r>
-      <w:proofErr w:type="gramEnd"/>
-      <w:r>
-        <w:t xml:space="preserve"> (Canny)</w:t>
+        <w:t>Edge detect (Canny)</w:t>
       </w:r>
     </w:p>
     <w:p>
@@ -1249,13 +1078,8 @@
         </w:numPr>
       </w:pPr>
       <w:r>
-        <w:t xml:space="preserve">mild </w:t>
-      </w:r>
-      <w:proofErr w:type="gramStart"/>
-      <w:r>
-        <w:t>denoise</w:t>
-      </w:r>
-      <w:proofErr w:type="gramEnd"/>
+        <w:t>mild denoise</w:t>
+      </w:r>
     </w:p>
     <w:p>
       <w:pPr>
@@ -1313,15 +1137,7 @@
         <w:t>OCR name region</w:t>
       </w:r>
       <w:r>
-        <w:t xml:space="preserve"> (even partial) → </w:t>
-      </w:r>
-      <w:proofErr w:type="spellStart"/>
-      <w:r>
-        <w:t>Scryfall</w:t>
-      </w:r>
-      <w:proofErr w:type="spellEnd"/>
-      <w:r>
-        <w:t xml:space="preserve"> fuzzy search → candidates list</w:t>
+        <w:t xml:space="preserve"> (even partial) → Scryfall fuzzy search → candidates list</w:t>
       </w:r>
       <w:r>
         <w:br/>
@@ -1384,13 +1200,8 @@
     </w:p>
     <w:p>
       <w:r>
-        <w:t xml:space="preserve">Given: normalized card patch + candidate list from </w:t>
-      </w:r>
-      <w:proofErr w:type="spellStart"/>
-      <w:r>
-        <w:t>Scryfall</w:t>
-      </w:r>
-      <w:proofErr w:type="spellEnd"/>
+        <w:t>Given: normalized card patch + candidate list from Scryfall</w:t>
+      </w:r>
       <w:r>
         <w:br/>
         <w:t>Goal: choose best match reliably.</w:t>
@@ -1413,39 +1224,7 @@
           <w:b/>
           <w:bCs/>
         </w:rPr>
-        <w:t>Perceptual hash (</w:t>
-      </w:r>
-      <w:proofErr w:type="spellStart"/>
-      <w:r>
-        <w:rPr>
-          <w:b/>
-          <w:bCs/>
-        </w:rPr>
-        <w:t>pHash</w:t>
-      </w:r>
-      <w:proofErr w:type="spellEnd"/>
-      <w:r>
-        <w:rPr>
-          <w:b/>
-          <w:bCs/>
-        </w:rPr>
-        <w:t>/</w:t>
-      </w:r>
-      <w:proofErr w:type="spellStart"/>
-      <w:r>
-        <w:rPr>
-          <w:b/>
-          <w:bCs/>
-        </w:rPr>
-        <w:t>dHash</w:t>
-      </w:r>
-      <w:proofErr w:type="spellEnd"/>
-      <w:r>
-        <w:rPr>
-          <w:b/>
-          <w:bCs/>
-        </w:rPr>
-        <w:t>)</w:t>
+        <w:t>Perceptual hash (pHash/dHash)</w:t>
       </w:r>
     </w:p>
     <w:p>
@@ -1596,7 +1375,6 @@
       <w:r>
         <w:t xml:space="preserve"> start with </w:t>
       </w:r>
-      <w:proofErr w:type="spellStart"/>
       <w:r>
         <w:rPr>
           <w:b/>
@@ -1604,7 +1382,6 @@
         </w:rPr>
         <w:t>pHash</w:t>
       </w:r>
-      <w:proofErr w:type="spellEnd"/>
       <w:r>
         <w:t xml:space="preserve"> confirmation. If it’s not robust enough, upgrade to embeddings later.</w:t>
       </w:r>
@@ -1626,15 +1403,7 @@
     </w:p>
     <w:p>
       <w:r>
-        <w:t xml:space="preserve">Once you’ve selected a </w:t>
-      </w:r>
-      <w:proofErr w:type="spellStart"/>
-      <w:r>
-        <w:t>Scryfall</w:t>
-      </w:r>
-      <w:proofErr w:type="spellEnd"/>
-      <w:r>
-        <w:t xml:space="preserve"> “best match”:</w:t>
+        <w:t>Once you’ve selected a Scryfall “best match”:</w:t>
       </w:r>
     </w:p>
     <w:p>
@@ -1645,31 +1414,7 @@
         </w:numPr>
       </w:pPr>
       <w:r>
-        <w:t xml:space="preserve">store </w:t>
-      </w:r>
-      <w:proofErr w:type="spellStart"/>
-      <w:r>
-        <w:t>scryfall_id</w:t>
-      </w:r>
-      <w:proofErr w:type="spellEnd"/>
-      <w:r>
-        <w:t xml:space="preserve">, </w:t>
-      </w:r>
-      <w:proofErr w:type="spellStart"/>
-      <w:r>
-        <w:t>set_code</w:t>
-      </w:r>
-      <w:proofErr w:type="spellEnd"/>
-      <w:r>
-        <w:t xml:space="preserve">, </w:t>
-      </w:r>
-      <w:proofErr w:type="spellStart"/>
-      <w:r>
-        <w:t>collector_number</w:t>
-      </w:r>
-      <w:proofErr w:type="spellEnd"/>
-      <w:r>
-        <w:t>, name, image URIs</w:t>
+        <w:t>store scryfall_id, set_code, collector_number, name, image URIs</w:t>
       </w:r>
     </w:p>
     <w:p>
@@ -1680,15 +1425,7 @@
         </w:numPr>
       </w:pPr>
       <w:r>
-        <w:t xml:space="preserve">for double-faced / split cards, store by the printing’s </w:t>
-      </w:r>
-      <w:proofErr w:type="spellStart"/>
-      <w:r>
-        <w:t>scryfall_id</w:t>
-      </w:r>
-      <w:proofErr w:type="spellEnd"/>
-      <w:r>
-        <w:t xml:space="preserve"> and handle layout in export.</w:t>
+        <w:t>for double-faced / split cards, store by the printing’s scryfall_id and handle layout in export.</w:t>
       </w:r>
     </w:p>
     <w:p>
@@ -1708,15 +1445,7 @@
     </w:p>
     <w:p>
       <w:r>
-        <w:t xml:space="preserve">Even the best scanner needs a </w:t>
-      </w:r>
-      <w:proofErr w:type="gramStart"/>
-      <w:r>
-        <w:t>confirm</w:t>
-      </w:r>
-      <w:proofErr w:type="gramEnd"/>
-      <w:r>
-        <w:t xml:space="preserve"> step:</w:t>
+        <w:t>Even the best scanner needs a confirm step:</w:t>
       </w:r>
     </w:p>
     <w:p>
@@ -1965,23 +1694,7 @@
         </w:numPr>
       </w:pPr>
       <w:r>
-        <w:t xml:space="preserve">export preset dropdown (Generic, </w:t>
-      </w:r>
-      <w:proofErr w:type="spellStart"/>
-      <w:r>
-        <w:t>Moxfield</w:t>
-      </w:r>
-      <w:proofErr w:type="spellEnd"/>
-      <w:r>
-        <w:t xml:space="preserve">, </w:t>
-      </w:r>
-      <w:proofErr w:type="spellStart"/>
-      <w:r>
-        <w:t>Archidekt</w:t>
-      </w:r>
-      <w:proofErr w:type="spellEnd"/>
-      <w:r>
-        <w:t>, etc.)</w:t>
+        <w:t>export preset dropdown (Generic, Moxfield, Archidekt, etc.)</w:t>
       </w:r>
     </w:p>
     <w:p>
@@ -2166,28 +1879,12 @@
         </w:numPr>
       </w:pPr>
       <w:r>
-        <w:t xml:space="preserve">transformations (e.g., foil as “foil” vs </w:t>
-      </w:r>
-      <w:proofErr w:type="spellStart"/>
-      <w:r>
-        <w:t>boolean</w:t>
-      </w:r>
-      <w:proofErr w:type="spellEnd"/>
-      <w:r>
-        <w:t>)</w:t>
-      </w:r>
-    </w:p>
-    <w:p>
-      <w:r>
-        <w:t xml:space="preserve">Implementation: a JSON file like </w:t>
-      </w:r>
-      <w:proofErr w:type="spellStart"/>
-      <w:r>
-        <w:t>export_presets.json</w:t>
-      </w:r>
-      <w:proofErr w:type="spellEnd"/>
-      <w:r>
-        <w:t xml:space="preserve"> that your app reads.</w:t>
+        <w:t>transformations (e.g., foil as “foil” vs boolean)</w:t>
+      </w:r>
+    </w:p>
+    <w:p>
+      <w:r>
+        <w:t>Implementation: a JSON file like export_presets.json that your app reads.</w:t>
       </w:r>
     </w:p>
     <w:p>
@@ -2209,41 +1906,12 @@
           <w:b/>
           <w:bCs/>
         </w:rPr>
-        <w:t>6) Caching strategy (speed + offline-</w:t>
-      </w:r>
-      <w:proofErr w:type="spellStart"/>
-      <w:r>
-        <w:rPr>
-          <w:b/>
-          <w:bCs/>
-        </w:rPr>
-        <w:t>ish</w:t>
-      </w:r>
-      <w:proofErr w:type="spellEnd"/>
-      <w:r>
-        <w:rPr>
-          <w:b/>
-          <w:bCs/>
-        </w:rPr>
-        <w:t>)</w:t>
-      </w:r>
-    </w:p>
-    <w:p>
-      <w:proofErr w:type="gramStart"/>
-      <w:r>
-        <w:t>Avoid re-</w:t>
-      </w:r>
-      <w:proofErr w:type="gramEnd"/>
-      <w:r>
-        <w:t xml:space="preserve">downloading images and re-calling </w:t>
-      </w:r>
-      <w:proofErr w:type="spellStart"/>
-      <w:r>
-        <w:t>Scryfall</w:t>
-      </w:r>
-      <w:proofErr w:type="spellEnd"/>
-      <w:r>
-        <w:t>:</w:t>
+        <w:t>6) Caching strategy (speed + offline-ish)</w:t>
+      </w:r>
+    </w:p>
+    <w:p>
+      <w:r>
+        <w:t>Avoid re-downloading images and re-calling Scryfall:</w:t>
       </w:r>
     </w:p>
     <w:p>
@@ -2254,15 +1922,7 @@
         </w:numPr>
       </w:pPr>
       <w:r>
-        <w:t xml:space="preserve">Cache </w:t>
-      </w:r>
-      <w:proofErr w:type="spellStart"/>
-      <w:r>
-        <w:t>Scryfall</w:t>
-      </w:r>
-      <w:proofErr w:type="spellEnd"/>
-      <w:r>
-        <w:t xml:space="preserve"> card JSON in cards table.</w:t>
+        <w:t>Cache Scryfall card JSON in cards table.</w:t>
       </w:r>
     </w:p>
     <w:p>
@@ -2305,11 +1965,9 @@
           <w:numId w:val="22"/>
         </w:numPr>
       </w:pPr>
-      <w:proofErr w:type="spellStart"/>
       <w:r>
         <w:t>cards.phash_art</w:t>
       </w:r>
-      <w:proofErr w:type="spellEnd"/>
     </w:p>
     <w:p>
       <w:pPr>
@@ -2318,11 +1976,9 @@
           <w:numId w:val="22"/>
         </w:numPr>
       </w:pPr>
-      <w:proofErr w:type="spellStart"/>
       <w:r>
         <w:t>cards.phash_full</w:t>
       </w:r>
-      <w:proofErr w:type="spellEnd"/>
     </w:p>
     <w:p>
       <w:pPr>
@@ -2332,13 +1988,8 @@
         </w:numPr>
       </w:pPr>
       <w:r>
-        <w:t xml:space="preserve">or </w:t>
-      </w:r>
-      <w:proofErr w:type="spellStart"/>
-      <w:r>
-        <w:t>cards.embedding_blob</w:t>
-      </w:r>
-      <w:proofErr w:type="spellEnd"/>
+        <w:t>or cards.embedding_blob</w:t>
+      </w:r>
     </w:p>
     <w:p>
       <w:r>
@@ -2385,8 +2036,14 @@
         </w:numPr>
       </w:pPr>
       <w:r>
+        <w:t xml:space="preserve">Done: </w:t>
+      </w:r>
+      <w:r>
         <w:t>PySide6 window</w:t>
       </w:r>
+      <w:r>
+        <w:t>, camera preview</w:t>
+      </w:r>
     </w:p>
     <w:p>
       <w:pPr>
@@ -2396,19 +2053,19 @@
         </w:numPr>
       </w:pPr>
       <w:r>
-        <w:t>camera preview</w:t>
-      </w:r>
-    </w:p>
-    <w:p>
-      <w:pPr>
-        <w:numPr>
-          <w:ilvl w:val="0"/>
+        <w:t>capture frame to file</w:t>
+      </w:r>
+      <w:r>
+        <w:t>: currently manual button</w:t>
+      </w:r>
+    </w:p>
+    <w:p>
+      <w:pPr>
+        <w:numPr>
+          <w:ilvl w:val="1"/>
           <w:numId w:val="23"/>
         </w:numPr>
       </w:pPr>
-      <w:r>
-        <w:t>capture frame to file</w:t>
-      </w:r>
     </w:p>
     <w:p>
       <w:pPr>
@@ -2472,33 +2129,140 @@
     </w:p>
     <w:p>
       <w:pPr>
-        <w:rPr>
-          <w:b/>
-          <w:bCs/>
-        </w:rPr>
-      </w:pPr>
-      <w:r>
-        <w:rPr>
-          <w:b/>
-          <w:bCs/>
-        </w:rPr>
-        <w:t xml:space="preserve">Milestone 3 — </w:t>
-      </w:r>
-      <w:proofErr w:type="spellStart"/>
-      <w:r>
-        <w:rPr>
-          <w:b/>
-          <w:bCs/>
-        </w:rPr>
-        <w:t>Scryfall</w:t>
-      </w:r>
-      <w:proofErr w:type="spellEnd"/>
-      <w:r>
-        <w:rPr>
-          <w:b/>
-          <w:bCs/>
-        </w:rPr>
-        <w:t xml:space="preserve"> integration</w:t>
+        <w:numPr>
+          <w:ilvl w:val="0"/>
+          <w:numId w:val="24"/>
+        </w:numPr>
+        <w:rPr>
+          <w:b/>
+          <w:bCs/>
+        </w:rPr>
+      </w:pPr>
+      <w:r>
+        <w:rPr>
+          <w:b/>
+          <w:bCs/>
+        </w:rPr>
+        <w:t>2A — Detection + Trigger (what you’re asking about)</w:t>
+      </w:r>
+    </w:p>
+    <w:p>
+      <w:pPr>
+        <w:numPr>
+          <w:ilvl w:val="1"/>
+          <w:numId w:val="24"/>
+        </w:numPr>
+      </w:pPr>
+      <w:r>
+        <w:t xml:space="preserve">frame stream processing </w:t>
+      </w:r>
+    </w:p>
+    <w:p>
+      <w:pPr>
+        <w:numPr>
+          <w:ilvl w:val="1"/>
+          <w:numId w:val="24"/>
+        </w:numPr>
+      </w:pPr>
+      <w:r>
+        <w:t xml:space="preserve">change detection </w:t>
+      </w:r>
+    </w:p>
+    <w:p>
+      <w:pPr>
+        <w:numPr>
+          <w:ilvl w:val="1"/>
+          <w:numId w:val="24"/>
+        </w:numPr>
+      </w:pPr>
+      <w:r>
+        <w:t xml:space="preserve">stability debounce </w:t>
+      </w:r>
+    </w:p>
+    <w:p>
+      <w:pPr>
+        <w:numPr>
+          <w:ilvl w:val="1"/>
+          <w:numId w:val="24"/>
+        </w:numPr>
+      </w:pPr>
+      <w:r>
+        <w:t xml:space="preserve">auto-trigger scan </w:t>
+      </w:r>
+    </w:p>
+    <w:p>
+      <w:pPr>
+        <w:numPr>
+          <w:ilvl w:val="0"/>
+          <w:numId w:val="24"/>
+        </w:numPr>
+        <w:rPr>
+          <w:b/>
+          <w:bCs/>
+        </w:rPr>
+      </w:pPr>
+      <w:r>
+        <w:rPr>
+          <w:b/>
+          <w:bCs/>
+        </w:rPr>
+        <w:t>2B — Card extraction</w:t>
+      </w:r>
+    </w:p>
+    <w:p>
+      <w:pPr>
+        <w:numPr>
+          <w:ilvl w:val="1"/>
+          <w:numId w:val="24"/>
+        </w:numPr>
+      </w:pPr>
+      <w:r>
+        <w:t xml:space="preserve">contour detection </w:t>
+      </w:r>
+    </w:p>
+    <w:p>
+      <w:pPr>
+        <w:numPr>
+          <w:ilvl w:val="1"/>
+          <w:numId w:val="24"/>
+        </w:numPr>
+      </w:pPr>
+      <w:r>
+        <w:t xml:space="preserve">perspective transform </w:t>
+      </w:r>
+    </w:p>
+    <w:p>
+      <w:pPr>
+        <w:numPr>
+          <w:ilvl w:val="1"/>
+          <w:numId w:val="24"/>
+        </w:numPr>
+      </w:pPr>
+      <w:r>
+        <w:t xml:space="preserve">normalized card image </w:t>
+      </w:r>
+    </w:p>
+    <w:p>
+      <w:pPr>
+        <w:numPr>
+          <w:ilvl w:val="0"/>
+          <w:numId w:val="24"/>
+        </w:numPr>
+      </w:pPr>
+    </w:p>
+    <w:p>
+      <w:pPr>
+        <w:rPr>
+          <w:b/>
+          <w:bCs/>
+        </w:rPr>
+      </w:pPr>
+      <w:r>
+        <w:rPr>
+          <w:b/>
+          <w:bCs/>
+        </w:rPr>
+        <w:t>Milestone 3 — Scryfall integration</w:t>
       </w:r>
     </w:p>
     <w:p>
@@ -2509,15 +2273,7 @@
         </w:numPr>
       </w:pPr>
       <w:r>
-        <w:t xml:space="preserve">OCR name region → </w:t>
-      </w:r>
-      <w:proofErr w:type="spellStart"/>
-      <w:r>
-        <w:t>Scryfall</w:t>
-      </w:r>
-      <w:proofErr w:type="spellEnd"/>
-      <w:r>
-        <w:t xml:space="preserve"> fuzzy search</w:t>
+        <w:t>OCR name region → Scryfall fuzzy search</w:t>
       </w:r>
     </w:p>
     <w:p>
@@ -2576,15 +2332,7 @@
         </w:numPr>
       </w:pPr>
       <w:r>
-        <w:t xml:space="preserve">compute </w:t>
-      </w:r>
-      <w:proofErr w:type="spellStart"/>
-      <w:r>
-        <w:t>pHash</w:t>
-      </w:r>
-      <w:proofErr w:type="spellEnd"/>
-      <w:r>
-        <w:t xml:space="preserve"> on art crop</w:t>
+        <w:t>compute pHash on art crop</w:t>
       </w:r>
     </w:p>
     <w:p>
@@ -2643,6 +2391,7 @@
         </w:numPr>
       </w:pPr>
       <w:r>
+        <w:lastRenderedPageBreak/>
         <w:t>browsing/searching within a collection</w:t>
       </w:r>
     </w:p>
@@ -2761,7 +2510,6 @@
         </w:numPr>
       </w:pPr>
       <w:r>
-        <w:lastRenderedPageBreak/>
         <w:t>arrows = pick alternative</w:t>
       </w:r>
     </w:p>
@@ -2946,6 +2694,7 @@
         </w:numPr>
       </w:pPr>
       <w:r>
+        <w:lastRenderedPageBreak/>
         <w:t>Scans work reasonably on foils because you:</w:t>
       </w:r>
     </w:p>
@@ -2996,7 +2745,7 @@
     <w:p>
       <w:r>
         <w:pict w14:anchorId="7A9ED27C">
-          <v:rect id="_x0000_i1036" style="width:0;height:1.5pt" o:hralign="center" o:hrstd="t" o:hr="t" fillcolor="#a0a0a0" stroked="f"/>
+          <v:rect id="_x0000_i1035" style="width:0;height:1.5pt" o:hralign="center" o:hrstd="t" o:hr="t" fillcolor="#a0a0a0" stroked="f"/>
         </w:pict>
       </w:r>
     </w:p>
@@ -3029,23 +2778,7 @@
           <w:b/>
           <w:bCs/>
         </w:rPr>
-        <w:t xml:space="preserve">OCR name-region → </w:t>
-      </w:r>
-      <w:proofErr w:type="spellStart"/>
-      <w:r>
-        <w:rPr>
-          <w:b/>
-          <w:bCs/>
-        </w:rPr>
-        <w:t>Scryfall</w:t>
-      </w:r>
-      <w:proofErr w:type="spellEnd"/>
-      <w:r>
-        <w:rPr>
-          <w:b/>
-          <w:bCs/>
-        </w:rPr>
-        <w:t xml:space="preserve"> search</w:t>
+        <w:t>OCR name-region → Scryfall search</w:t>
       </w:r>
     </w:p>
     <w:p>
@@ -3068,36 +2801,12 @@
         <w:t>D)</w:t>
       </w:r>
       <w:r>
-        <w:t xml:space="preserve"> OCR → </w:t>
-      </w:r>
-      <w:proofErr w:type="spellStart"/>
-      <w:r>
-        <w:t>Scryfall</w:t>
-      </w:r>
-      <w:proofErr w:type="spellEnd"/>
-      <w:r>
-        <w:t xml:space="preserve"> pipeline</w:t>
-      </w:r>
-    </w:p>
-    <w:p>
-      <w:r>
-        <w:t>  read APIs for GUI (</w:t>
-      </w:r>
-      <w:proofErr w:type="spellStart"/>
-      <w:r>
-        <w:t>list_collections</w:t>
-      </w:r>
-      <w:proofErr w:type="spellEnd"/>
-      <w:r>
-        <w:t xml:space="preserve">, </w:t>
-      </w:r>
-      <w:proofErr w:type="spellStart"/>
-      <w:r>
-        <w:t>list_entries</w:t>
-      </w:r>
-      <w:proofErr w:type="spellEnd"/>
-      <w:r>
-        <w:t>)</w:t>
+        <w:t xml:space="preserve"> OCR → Scryfall pipeline</w:t>
+      </w:r>
+    </w:p>
+    <w:p>
+      <w:r>
+        <w:t>  read APIs for GUI (list_collections, list_entries)</w:t>
       </w:r>
     </w:p>
     <w:p>
@@ -3107,15 +2816,7 @@
     </w:p>
     <w:p>
       <w:r>
-        <w:t xml:space="preserve">  </w:t>
-      </w:r>
-      <w:proofErr w:type="spellStart"/>
-      <w:r>
-        <w:t>Scryfall</w:t>
-      </w:r>
-      <w:proofErr w:type="spellEnd"/>
-      <w:r>
-        <w:t xml:space="preserve"> cache freshness policy</w:t>
+        <w:t>  Scryfall cache freshness policy</w:t>
       </w:r>
     </w:p>
     <w:p/>
@@ -3139,15 +2840,7 @@
         <w:t>“Scan Card” flow</w:t>
       </w:r>
       <w:r>
-        <w:t xml:space="preserve">: open a dialog that lets you simulate adding a card (for now), calling </w:t>
-      </w:r>
-      <w:proofErr w:type="spellStart"/>
-      <w:r>
-        <w:t>add_card_to_collection_service</w:t>
-      </w:r>
-      <w:proofErr w:type="spellEnd"/>
-      <w:r>
-        <w:t>.</w:t>
+        <w:t>: open a dialog that lets you simulate adding a card (for now), calling add_card_to_collection_service.</w:t>
       </w:r>
     </w:p>
     <w:p>
@@ -3227,15 +2920,7 @@
         <w:t>card-crop overlay</w:t>
       </w:r>
       <w:r>
-        <w:t xml:space="preserve"> (</w:t>
-      </w:r>
-      <w:proofErr w:type="spellStart"/>
-      <w:r>
-        <w:t>rect</w:t>
-      </w:r>
-      <w:proofErr w:type="spellEnd"/>
-      <w:r>
-        <w:t xml:space="preserve"> guide) so you align the card</w:t>
+        <w:t xml:space="preserve"> (rect guide) so you align the card</w:t>
       </w:r>
     </w:p>
     <w:p>
@@ -3246,15 +2931,167 @@
         </w:numPr>
       </w:pPr>
       <w:r>
-        <w:t xml:space="preserve">Save captured frames to disk for debugging the OCR + </w:t>
-      </w:r>
-      <w:proofErr w:type="spellStart"/>
-      <w:r>
-        <w:t>Scryfall</w:t>
-      </w:r>
-      <w:proofErr w:type="spellEnd"/>
-      <w:r>
-        <w:t xml:space="preserve"> matching pipeline</w:t>
+        <w:t>Save captured frames to disk for debugging the OCR + Scryfall matching pipeline</w:t>
+      </w:r>
+    </w:p>
+    <w:p>
+      <w:r>
+        <w:lastRenderedPageBreak/>
+        <w:t>In this order:</w:t>
+      </w:r>
+    </w:p>
+    <w:p>
+      <w:pPr>
+        <w:numPr>
+          <w:ilvl w:val="0"/>
+          <w:numId w:val="38"/>
+        </w:numPr>
+      </w:pPr>
+      <w:r>
+        <w:t xml:space="preserve">Add scan controls to the UI: </w:t>
+      </w:r>
+    </w:p>
+    <w:p>
+      <w:pPr>
+        <w:numPr>
+          <w:ilvl w:val="1"/>
+          <w:numId w:val="38"/>
+        </w:numPr>
+      </w:pPr>
+      <w:r>
+        <w:t xml:space="preserve">Auto Scan </w:t>
+      </w:r>
+    </w:p>
+    <w:p>
+      <w:pPr>
+        <w:numPr>
+          <w:ilvl w:val="1"/>
+          <w:numId w:val="38"/>
+        </w:numPr>
+      </w:pPr>
+      <w:r>
+        <w:t xml:space="preserve">Foil toggle </w:t>
+      </w:r>
+    </w:p>
+    <w:p>
+      <w:pPr>
+        <w:numPr>
+          <w:ilvl w:val="1"/>
+          <w:numId w:val="38"/>
+        </w:numPr>
+      </w:pPr>
+      <w:r>
+        <w:t xml:space="preserve">Condition dropdown </w:t>
+      </w:r>
+    </w:p>
+    <w:p>
+      <w:pPr>
+        <w:numPr>
+          <w:ilvl w:val="1"/>
+          <w:numId w:val="38"/>
+        </w:numPr>
+      </w:pPr>
+      <w:r>
+        <w:t xml:space="preserve">Rescan Now </w:t>
+      </w:r>
+    </w:p>
+    <w:p>
+      <w:pPr>
+        <w:numPr>
+          <w:ilvl w:val="0"/>
+          <w:numId w:val="38"/>
+        </w:numPr>
+      </w:pPr>
+      <w:r>
+        <w:t xml:space="preserve">Add scanner_controller.py </w:t>
+      </w:r>
+    </w:p>
+    <w:p>
+      <w:pPr>
+        <w:numPr>
+          <w:ilvl w:val="0"/>
+          <w:numId w:val="38"/>
+        </w:numPr>
+      </w:pPr>
+      <w:r>
+        <w:t xml:space="preserve">Wire CameraWidget.latest_frame_bgr into the controller </w:t>
+      </w:r>
+    </w:p>
+    <w:p>
+      <w:pPr>
+        <w:numPr>
+          <w:ilvl w:val="0"/>
+          <w:numId w:val="38"/>
+        </w:numPr>
+      </w:pPr>
+      <w:r>
+        <w:t xml:space="preserve">Implement: </w:t>
+      </w:r>
+    </w:p>
+    <w:p>
+      <w:pPr>
+        <w:numPr>
+          <w:ilvl w:val="1"/>
+          <w:numId w:val="38"/>
+        </w:numPr>
+      </w:pPr>
+      <w:r>
+        <w:t xml:space="preserve">central crop region </w:t>
+      </w:r>
+    </w:p>
+    <w:p>
+      <w:pPr>
+        <w:numPr>
+          <w:ilvl w:val="1"/>
+          <w:numId w:val="38"/>
+        </w:numPr>
+      </w:pPr>
+      <w:r>
+        <w:t xml:space="preserve">change detection </w:t>
+      </w:r>
+    </w:p>
+    <w:p>
+      <w:pPr>
+        <w:numPr>
+          <w:ilvl w:val="1"/>
+          <w:numId w:val="38"/>
+        </w:numPr>
+      </w:pPr>
+      <w:r>
+        <w:t xml:space="preserve">stability timer </w:t>
+      </w:r>
+    </w:p>
+    <w:p>
+      <w:pPr>
+        <w:numPr>
+          <w:ilvl w:val="1"/>
+          <w:numId w:val="38"/>
+        </w:numPr>
+      </w:pPr>
+      <w:r>
+        <w:t xml:space="preserve">cooldown after successful scan </w:t>
+      </w:r>
+    </w:p>
+    <w:p>
+      <w:pPr>
+        <w:numPr>
+          <w:ilvl w:val="0"/>
+          <w:numId w:val="38"/>
+        </w:numPr>
+      </w:pPr>
+      <w:r>
+        <w:t xml:space="preserve">For now, plug in a fake recognizer so the auto-scan loop works end-to-end </w:t>
+      </w:r>
+    </w:p>
+    <w:p>
+      <w:pPr>
+        <w:numPr>
+          <w:ilvl w:val="0"/>
+          <w:numId w:val="38"/>
+        </w:numPr>
+      </w:pPr>
+      <w:r>
+        <w:t>Then replace fake recognizer with real OCR/Scryfall matching</w:t>
       </w:r>
     </w:p>
     <w:p/>
@@ -3886,7 +3723,7 @@
         <w:sz w:val="20"/>
       </w:rPr>
     </w:lvl>
-    <w:lvl w:ilvl="1" w:tentative="1">
+    <w:lvl w:ilvl="1">
       <w:start w:val="1"/>
       <w:numFmt w:val="bullet"/>
       <w:lvlText w:val="o"/>
@@ -5046,7 +4883,7 @@
         <w:sz w:val="20"/>
       </w:rPr>
     </w:lvl>
-    <w:lvl w:ilvl="1" w:tentative="1">
+    <w:lvl w:ilvl="1">
       <w:start w:val="1"/>
       <w:numFmt w:val="bullet"/>
       <w:lvlText w:val="o"/>
@@ -6755,6 +6592,155 @@
     </w:lvl>
   </w:abstractNum>
   <w:abstractNum w:abstractNumId="24" w15:restartNumberingAfterBreak="0">
+    <w:nsid w:val="4F971E92"/>
+    <w:multiLevelType w:val="multilevel"/>
+    <w:tmpl w:val="DA628C30"/>
+    <w:lvl w:ilvl="0">
+      <w:start w:val="1"/>
+      <w:numFmt w:val="bullet"/>
+      <w:lvlText w:val=""/>
+      <w:lvlJc w:val="left"/>
+      <w:pPr>
+        <w:tabs>
+          <w:tab w:val="num" w:pos="720"/>
+        </w:tabs>
+        <w:ind w:left="720" w:hanging="360"/>
+      </w:pPr>
+      <w:rPr>
+        <w:rFonts w:ascii="Symbol" w:hAnsi="Symbol" w:hint="default"/>
+        <w:sz w:val="20"/>
+      </w:rPr>
+    </w:lvl>
+    <w:lvl w:ilvl="1" w:tentative="1">
+      <w:start w:val="1"/>
+      <w:numFmt w:val="bullet"/>
+      <w:lvlText w:val="o"/>
+      <w:lvlJc w:val="left"/>
+      <w:pPr>
+        <w:tabs>
+          <w:tab w:val="num" w:pos="1440"/>
+        </w:tabs>
+        <w:ind w:left="1440" w:hanging="360"/>
+      </w:pPr>
+      <w:rPr>
+        <w:rFonts w:ascii="Courier New" w:hAnsi="Courier New" w:hint="default"/>
+        <w:sz w:val="20"/>
+      </w:rPr>
+    </w:lvl>
+    <w:lvl w:ilvl="2" w:tentative="1">
+      <w:start w:val="1"/>
+      <w:numFmt w:val="bullet"/>
+      <w:lvlText w:val=""/>
+      <w:lvlJc w:val="left"/>
+      <w:pPr>
+        <w:tabs>
+          <w:tab w:val="num" w:pos="2160"/>
+        </w:tabs>
+        <w:ind w:left="2160" w:hanging="360"/>
+      </w:pPr>
+      <w:rPr>
+        <w:rFonts w:ascii="Wingdings" w:hAnsi="Wingdings" w:hint="default"/>
+        <w:sz w:val="20"/>
+      </w:rPr>
+    </w:lvl>
+    <w:lvl w:ilvl="3" w:tentative="1">
+      <w:start w:val="1"/>
+      <w:numFmt w:val="bullet"/>
+      <w:lvlText w:val=""/>
+      <w:lvlJc w:val="left"/>
+      <w:pPr>
+        <w:tabs>
+          <w:tab w:val="num" w:pos="2880"/>
+        </w:tabs>
+        <w:ind w:left="2880" w:hanging="360"/>
+      </w:pPr>
+      <w:rPr>
+        <w:rFonts w:ascii="Wingdings" w:hAnsi="Wingdings" w:hint="default"/>
+        <w:sz w:val="20"/>
+      </w:rPr>
+    </w:lvl>
+    <w:lvl w:ilvl="4" w:tentative="1">
+      <w:start w:val="1"/>
+      <w:numFmt w:val="bullet"/>
+      <w:lvlText w:val=""/>
+      <w:lvlJc w:val="left"/>
+      <w:pPr>
+        <w:tabs>
+          <w:tab w:val="num" w:pos="3600"/>
+        </w:tabs>
+        <w:ind w:left="3600" w:hanging="360"/>
+      </w:pPr>
+      <w:rPr>
+        <w:rFonts w:ascii="Wingdings" w:hAnsi="Wingdings" w:hint="default"/>
+        <w:sz w:val="20"/>
+      </w:rPr>
+    </w:lvl>
+    <w:lvl w:ilvl="5" w:tentative="1">
+      <w:start w:val="1"/>
+      <w:numFmt w:val="bullet"/>
+      <w:lvlText w:val=""/>
+      <w:lvlJc w:val="left"/>
+      <w:pPr>
+        <w:tabs>
+          <w:tab w:val="num" w:pos="4320"/>
+        </w:tabs>
+        <w:ind w:left="4320" w:hanging="360"/>
+      </w:pPr>
+      <w:rPr>
+        <w:rFonts w:ascii="Wingdings" w:hAnsi="Wingdings" w:hint="default"/>
+        <w:sz w:val="20"/>
+      </w:rPr>
+    </w:lvl>
+    <w:lvl w:ilvl="6" w:tentative="1">
+      <w:start w:val="1"/>
+      <w:numFmt w:val="bullet"/>
+      <w:lvlText w:val=""/>
+      <w:lvlJc w:val="left"/>
+      <w:pPr>
+        <w:tabs>
+          <w:tab w:val="num" w:pos="5040"/>
+        </w:tabs>
+        <w:ind w:left="5040" w:hanging="360"/>
+      </w:pPr>
+      <w:rPr>
+        <w:rFonts w:ascii="Wingdings" w:hAnsi="Wingdings" w:hint="default"/>
+        <w:sz w:val="20"/>
+      </w:rPr>
+    </w:lvl>
+    <w:lvl w:ilvl="7" w:tentative="1">
+      <w:start w:val="1"/>
+      <w:numFmt w:val="bullet"/>
+      <w:lvlText w:val=""/>
+      <w:lvlJc w:val="left"/>
+      <w:pPr>
+        <w:tabs>
+          <w:tab w:val="num" w:pos="5760"/>
+        </w:tabs>
+        <w:ind w:left="5760" w:hanging="360"/>
+      </w:pPr>
+      <w:rPr>
+        <w:rFonts w:ascii="Wingdings" w:hAnsi="Wingdings" w:hint="default"/>
+        <w:sz w:val="20"/>
+      </w:rPr>
+    </w:lvl>
+    <w:lvl w:ilvl="8" w:tentative="1">
+      <w:start w:val="1"/>
+      <w:numFmt w:val="bullet"/>
+      <w:lvlText w:val=""/>
+      <w:lvlJc w:val="left"/>
+      <w:pPr>
+        <w:tabs>
+          <w:tab w:val="num" w:pos="6480"/>
+        </w:tabs>
+        <w:ind w:left="6480" w:hanging="360"/>
+      </w:pPr>
+      <w:rPr>
+        <w:rFonts w:ascii="Wingdings" w:hAnsi="Wingdings" w:hint="default"/>
+        <w:sz w:val="20"/>
+      </w:rPr>
+    </w:lvl>
+  </w:abstractNum>
+  <w:abstractNum w:abstractNumId="25" w15:restartNumberingAfterBreak="0">
     <w:nsid w:val="53540327"/>
     <w:multiLevelType w:val="multilevel"/>
     <w:tmpl w:val="246A6280"/>
@@ -6903,7 +6889,7 @@
       </w:rPr>
     </w:lvl>
   </w:abstractNum>
-  <w:abstractNum w:abstractNumId="25" w15:restartNumberingAfterBreak="0">
+  <w:abstractNum w:abstractNumId="26" w15:restartNumberingAfterBreak="0">
     <w:nsid w:val="56583BF8"/>
     <w:multiLevelType w:val="multilevel"/>
     <w:tmpl w:val="BACC9B68"/>
@@ -7052,7 +7038,7 @@
       </w:rPr>
     </w:lvl>
   </w:abstractNum>
-  <w:abstractNum w:abstractNumId="26" w15:restartNumberingAfterBreak="0">
+  <w:abstractNum w:abstractNumId="27" w15:restartNumberingAfterBreak="0">
     <w:nsid w:val="570235B6"/>
     <w:multiLevelType w:val="multilevel"/>
     <w:tmpl w:val="9AE4BF4E"/>
@@ -7201,7 +7187,7 @@
       </w:rPr>
     </w:lvl>
   </w:abstractNum>
-  <w:abstractNum w:abstractNumId="27" w15:restartNumberingAfterBreak="0">
+  <w:abstractNum w:abstractNumId="28" w15:restartNumberingAfterBreak="0">
     <w:nsid w:val="5845117C"/>
     <w:multiLevelType w:val="multilevel"/>
     <w:tmpl w:val="EEE69488"/>
@@ -7314,7 +7300,7 @@
       </w:pPr>
     </w:lvl>
   </w:abstractNum>
-  <w:abstractNum w:abstractNumId="28" w15:restartNumberingAfterBreak="0">
+  <w:abstractNum w:abstractNumId="29" w15:restartNumberingAfterBreak="0">
     <w:nsid w:val="5AFB2879"/>
     <w:multiLevelType w:val="multilevel"/>
     <w:tmpl w:val="DD7C8384"/>
@@ -7463,7 +7449,7 @@
       </w:rPr>
     </w:lvl>
   </w:abstractNum>
-  <w:abstractNum w:abstractNumId="29" w15:restartNumberingAfterBreak="0">
+  <w:abstractNum w:abstractNumId="30" w15:restartNumberingAfterBreak="0">
     <w:nsid w:val="5F410346"/>
     <w:multiLevelType w:val="multilevel"/>
     <w:tmpl w:val="70F26C6E"/>
@@ -7612,7 +7598,7 @@
       </w:rPr>
     </w:lvl>
   </w:abstractNum>
-  <w:abstractNum w:abstractNumId="30" w15:restartNumberingAfterBreak="0">
+  <w:abstractNum w:abstractNumId="31" w15:restartNumberingAfterBreak="0">
     <w:nsid w:val="5FFE5ADE"/>
     <w:multiLevelType w:val="multilevel"/>
     <w:tmpl w:val="60F29000"/>
@@ -7761,7 +7747,156 @@
       </w:rPr>
     </w:lvl>
   </w:abstractNum>
-  <w:abstractNum w:abstractNumId="31" w15:restartNumberingAfterBreak="0">
+  <w:abstractNum w:abstractNumId="32" w15:restartNumberingAfterBreak="0">
+    <w:nsid w:val="667C6704"/>
+    <w:multiLevelType w:val="multilevel"/>
+    <w:tmpl w:val="AA8C410A"/>
+    <w:lvl w:ilvl="0">
+      <w:start w:val="1"/>
+      <w:numFmt w:val="bullet"/>
+      <w:lvlText w:val=""/>
+      <w:lvlJc w:val="left"/>
+      <w:pPr>
+        <w:tabs>
+          <w:tab w:val="num" w:pos="720"/>
+        </w:tabs>
+        <w:ind w:left="720" w:hanging="360"/>
+      </w:pPr>
+      <w:rPr>
+        <w:rFonts w:ascii="Symbol" w:hAnsi="Symbol" w:hint="default"/>
+        <w:sz w:val="20"/>
+      </w:rPr>
+    </w:lvl>
+    <w:lvl w:ilvl="1" w:tentative="1">
+      <w:start w:val="1"/>
+      <w:numFmt w:val="bullet"/>
+      <w:lvlText w:val="o"/>
+      <w:lvlJc w:val="left"/>
+      <w:pPr>
+        <w:tabs>
+          <w:tab w:val="num" w:pos="1440"/>
+        </w:tabs>
+        <w:ind w:left="1440" w:hanging="360"/>
+      </w:pPr>
+      <w:rPr>
+        <w:rFonts w:ascii="Courier New" w:hAnsi="Courier New" w:hint="default"/>
+        <w:sz w:val="20"/>
+      </w:rPr>
+    </w:lvl>
+    <w:lvl w:ilvl="2" w:tentative="1">
+      <w:start w:val="1"/>
+      <w:numFmt w:val="bullet"/>
+      <w:lvlText w:val=""/>
+      <w:lvlJc w:val="left"/>
+      <w:pPr>
+        <w:tabs>
+          <w:tab w:val="num" w:pos="2160"/>
+        </w:tabs>
+        <w:ind w:left="2160" w:hanging="360"/>
+      </w:pPr>
+      <w:rPr>
+        <w:rFonts w:ascii="Wingdings" w:hAnsi="Wingdings" w:hint="default"/>
+        <w:sz w:val="20"/>
+      </w:rPr>
+    </w:lvl>
+    <w:lvl w:ilvl="3" w:tentative="1">
+      <w:start w:val="1"/>
+      <w:numFmt w:val="bullet"/>
+      <w:lvlText w:val=""/>
+      <w:lvlJc w:val="left"/>
+      <w:pPr>
+        <w:tabs>
+          <w:tab w:val="num" w:pos="2880"/>
+        </w:tabs>
+        <w:ind w:left="2880" w:hanging="360"/>
+      </w:pPr>
+      <w:rPr>
+        <w:rFonts w:ascii="Wingdings" w:hAnsi="Wingdings" w:hint="default"/>
+        <w:sz w:val="20"/>
+      </w:rPr>
+    </w:lvl>
+    <w:lvl w:ilvl="4" w:tentative="1">
+      <w:start w:val="1"/>
+      <w:numFmt w:val="bullet"/>
+      <w:lvlText w:val=""/>
+      <w:lvlJc w:val="left"/>
+      <w:pPr>
+        <w:tabs>
+          <w:tab w:val="num" w:pos="3600"/>
+        </w:tabs>
+        <w:ind w:left="3600" w:hanging="360"/>
+      </w:pPr>
+      <w:rPr>
+        <w:rFonts w:ascii="Wingdings" w:hAnsi="Wingdings" w:hint="default"/>
+        <w:sz w:val="20"/>
+      </w:rPr>
+    </w:lvl>
+    <w:lvl w:ilvl="5" w:tentative="1">
+      <w:start w:val="1"/>
+      <w:numFmt w:val="bullet"/>
+      <w:lvlText w:val=""/>
+      <w:lvlJc w:val="left"/>
+      <w:pPr>
+        <w:tabs>
+          <w:tab w:val="num" w:pos="4320"/>
+        </w:tabs>
+        <w:ind w:left="4320" w:hanging="360"/>
+      </w:pPr>
+      <w:rPr>
+        <w:rFonts w:ascii="Wingdings" w:hAnsi="Wingdings" w:hint="default"/>
+        <w:sz w:val="20"/>
+      </w:rPr>
+    </w:lvl>
+    <w:lvl w:ilvl="6" w:tentative="1">
+      <w:start w:val="1"/>
+      <w:numFmt w:val="bullet"/>
+      <w:lvlText w:val=""/>
+      <w:lvlJc w:val="left"/>
+      <w:pPr>
+        <w:tabs>
+          <w:tab w:val="num" w:pos="5040"/>
+        </w:tabs>
+        <w:ind w:left="5040" w:hanging="360"/>
+      </w:pPr>
+      <w:rPr>
+        <w:rFonts w:ascii="Wingdings" w:hAnsi="Wingdings" w:hint="default"/>
+        <w:sz w:val="20"/>
+      </w:rPr>
+    </w:lvl>
+    <w:lvl w:ilvl="7" w:tentative="1">
+      <w:start w:val="1"/>
+      <w:numFmt w:val="bullet"/>
+      <w:lvlText w:val=""/>
+      <w:lvlJc w:val="left"/>
+      <w:pPr>
+        <w:tabs>
+          <w:tab w:val="num" w:pos="5760"/>
+        </w:tabs>
+        <w:ind w:left="5760" w:hanging="360"/>
+      </w:pPr>
+      <w:rPr>
+        <w:rFonts w:ascii="Wingdings" w:hAnsi="Wingdings" w:hint="default"/>
+        <w:sz w:val="20"/>
+      </w:rPr>
+    </w:lvl>
+    <w:lvl w:ilvl="8" w:tentative="1">
+      <w:start w:val="1"/>
+      <w:numFmt w:val="bullet"/>
+      <w:lvlText w:val=""/>
+      <w:lvlJc w:val="left"/>
+      <w:pPr>
+        <w:tabs>
+          <w:tab w:val="num" w:pos="6480"/>
+        </w:tabs>
+        <w:ind w:left="6480" w:hanging="360"/>
+      </w:pPr>
+      <w:rPr>
+        <w:rFonts w:ascii="Wingdings" w:hAnsi="Wingdings" w:hint="default"/>
+        <w:sz w:val="20"/>
+      </w:rPr>
+    </w:lvl>
+  </w:abstractNum>
+  <w:abstractNum w:abstractNumId="33" w15:restartNumberingAfterBreak="0">
     <w:nsid w:val="670338A1"/>
     <w:multiLevelType w:val="multilevel"/>
     <w:tmpl w:val="59DA78F2"/>
@@ -7910,7 +8045,7 @@
       </w:rPr>
     </w:lvl>
   </w:abstractNum>
-  <w:abstractNum w:abstractNumId="32" w15:restartNumberingAfterBreak="0">
+  <w:abstractNum w:abstractNumId="34" w15:restartNumberingAfterBreak="0">
     <w:nsid w:val="67934A7A"/>
     <w:multiLevelType w:val="multilevel"/>
     <w:tmpl w:val="F5DA51E0"/>
@@ -8059,7 +8194,7 @@
       </w:rPr>
     </w:lvl>
   </w:abstractNum>
-  <w:abstractNum w:abstractNumId="33" w15:restartNumberingAfterBreak="0">
+  <w:abstractNum w:abstractNumId="35" w15:restartNumberingAfterBreak="0">
     <w:nsid w:val="6C0F4EBC"/>
     <w:multiLevelType w:val="multilevel"/>
     <w:tmpl w:val="AB60235C"/>
@@ -8208,7 +8343,7 @@
       </w:rPr>
     </w:lvl>
   </w:abstractNum>
-  <w:abstractNum w:abstractNumId="34" w15:restartNumberingAfterBreak="0">
+  <w:abstractNum w:abstractNumId="36" w15:restartNumberingAfterBreak="0">
     <w:nsid w:val="6E015D58"/>
     <w:multiLevelType w:val="multilevel"/>
     <w:tmpl w:val="6F06C3CC"/>
@@ -8357,7 +8492,124 @@
       </w:rPr>
     </w:lvl>
   </w:abstractNum>
-  <w:abstractNum w:abstractNumId="35" w15:restartNumberingAfterBreak="0">
+  <w:abstractNum w:abstractNumId="37" w15:restartNumberingAfterBreak="0">
+    <w:nsid w:val="722A12CE"/>
+    <w:multiLevelType w:val="multilevel"/>
+    <w:tmpl w:val="16180A0A"/>
+    <w:lvl w:ilvl="0">
+      <w:start w:val="1"/>
+      <w:numFmt w:val="decimal"/>
+      <w:lvlText w:val="%1."/>
+      <w:lvlJc w:val="left"/>
+      <w:pPr>
+        <w:tabs>
+          <w:tab w:val="num" w:pos="720"/>
+        </w:tabs>
+        <w:ind w:left="720" w:hanging="360"/>
+      </w:pPr>
+    </w:lvl>
+    <w:lvl w:ilvl="1">
+      <w:start w:val="1"/>
+      <w:numFmt w:val="bullet"/>
+      <w:lvlText w:val="o"/>
+      <w:lvlJc w:val="left"/>
+      <w:pPr>
+        <w:tabs>
+          <w:tab w:val="num" w:pos="1440"/>
+        </w:tabs>
+        <w:ind w:left="1440" w:hanging="360"/>
+      </w:pPr>
+      <w:rPr>
+        <w:rFonts w:ascii="Courier New" w:hAnsi="Courier New" w:hint="default"/>
+        <w:sz w:val="20"/>
+      </w:rPr>
+    </w:lvl>
+    <w:lvl w:ilvl="2" w:tentative="1">
+      <w:start w:val="1"/>
+      <w:numFmt w:val="decimal"/>
+      <w:lvlText w:val="%3."/>
+      <w:lvlJc w:val="left"/>
+      <w:pPr>
+        <w:tabs>
+          <w:tab w:val="num" w:pos="2160"/>
+        </w:tabs>
+        <w:ind w:left="2160" w:hanging="360"/>
+      </w:pPr>
+    </w:lvl>
+    <w:lvl w:ilvl="3" w:tentative="1">
+      <w:start w:val="1"/>
+      <w:numFmt w:val="decimal"/>
+      <w:lvlText w:val="%4."/>
+      <w:lvlJc w:val="left"/>
+      <w:pPr>
+        <w:tabs>
+          <w:tab w:val="num" w:pos="2880"/>
+        </w:tabs>
+        <w:ind w:left="2880" w:hanging="360"/>
+      </w:pPr>
+    </w:lvl>
+    <w:lvl w:ilvl="4" w:tentative="1">
+      <w:start w:val="1"/>
+      <w:numFmt w:val="decimal"/>
+      <w:lvlText w:val="%5."/>
+      <w:lvlJc w:val="left"/>
+      <w:pPr>
+        <w:tabs>
+          <w:tab w:val="num" w:pos="3600"/>
+        </w:tabs>
+        <w:ind w:left="3600" w:hanging="360"/>
+      </w:pPr>
+    </w:lvl>
+    <w:lvl w:ilvl="5" w:tentative="1">
+      <w:start w:val="1"/>
+      <w:numFmt w:val="decimal"/>
+      <w:lvlText w:val="%6."/>
+      <w:lvlJc w:val="left"/>
+      <w:pPr>
+        <w:tabs>
+          <w:tab w:val="num" w:pos="4320"/>
+        </w:tabs>
+        <w:ind w:left="4320" w:hanging="360"/>
+      </w:pPr>
+    </w:lvl>
+    <w:lvl w:ilvl="6" w:tentative="1">
+      <w:start w:val="1"/>
+      <w:numFmt w:val="decimal"/>
+      <w:lvlText w:val="%7."/>
+      <w:lvlJc w:val="left"/>
+      <w:pPr>
+        <w:tabs>
+          <w:tab w:val="num" w:pos="5040"/>
+        </w:tabs>
+        <w:ind w:left="5040" w:hanging="360"/>
+      </w:pPr>
+    </w:lvl>
+    <w:lvl w:ilvl="7" w:tentative="1">
+      <w:start w:val="1"/>
+      <w:numFmt w:val="decimal"/>
+      <w:lvlText w:val="%8."/>
+      <w:lvlJc w:val="left"/>
+      <w:pPr>
+        <w:tabs>
+          <w:tab w:val="num" w:pos="5760"/>
+        </w:tabs>
+        <w:ind w:left="5760" w:hanging="360"/>
+      </w:pPr>
+    </w:lvl>
+    <w:lvl w:ilvl="8" w:tentative="1">
+      <w:start w:val="1"/>
+      <w:numFmt w:val="decimal"/>
+      <w:lvlText w:val="%9."/>
+      <w:lvlJc w:val="left"/>
+      <w:pPr>
+        <w:tabs>
+          <w:tab w:val="num" w:pos="6480"/>
+        </w:tabs>
+        <w:ind w:left="6480" w:hanging="360"/>
+      </w:pPr>
+    </w:lvl>
+  </w:abstractNum>
+  <w:abstractNum w:abstractNumId="38" w15:restartNumberingAfterBreak="0">
     <w:nsid w:val="7A7B211E"/>
     <w:multiLevelType w:val="multilevel"/>
     <w:tmpl w:val="891211FC"/>
@@ -8506,7 +8758,7 @@
       </w:rPr>
     </w:lvl>
   </w:abstractNum>
-  <w:abstractNum w:abstractNumId="36" w15:restartNumberingAfterBreak="0">
+  <w:abstractNum w:abstractNumId="39" w15:restartNumberingAfterBreak="0">
     <w:nsid w:val="7C621AC0"/>
     <w:multiLevelType w:val="multilevel"/>
     <w:tmpl w:val="BF1AC2B2"/>
@@ -8662,7 +8914,7 @@
     <w:abstractNumId w:val="9"/>
   </w:num>
   <w:num w:numId="3" w16cid:durableId="36392002">
-    <w:abstractNumId w:val="34"/>
+    <w:abstractNumId w:val="36"/>
   </w:num>
   <w:num w:numId="4" w16cid:durableId="1493328976">
     <w:abstractNumId w:val="16"/>
@@ -8671,7 +8923,7 @@
     <w:abstractNumId w:val="2"/>
   </w:num>
   <w:num w:numId="6" w16cid:durableId="730466287">
-    <w:abstractNumId w:val="25"/>
+    <w:abstractNumId w:val="26"/>
   </w:num>
   <w:num w:numId="7" w16cid:durableId="2014871306">
     <w:abstractNumId w:val="8"/>
@@ -8689,25 +8941,25 @@
     <w:abstractNumId w:val="15"/>
   </w:num>
   <w:num w:numId="12" w16cid:durableId="961421518">
-    <w:abstractNumId w:val="35"/>
+    <w:abstractNumId w:val="38"/>
   </w:num>
   <w:num w:numId="13" w16cid:durableId="2096319449">
     <w:abstractNumId w:val="18"/>
   </w:num>
   <w:num w:numId="14" w16cid:durableId="1699114093">
-    <w:abstractNumId w:val="36"/>
+    <w:abstractNumId w:val="39"/>
   </w:num>
   <w:num w:numId="15" w16cid:durableId="1579896895">
-    <w:abstractNumId w:val="26"/>
+    <w:abstractNumId w:val="27"/>
   </w:num>
   <w:num w:numId="16" w16cid:durableId="384108050">
-    <w:abstractNumId w:val="24"/>
+    <w:abstractNumId w:val="25"/>
   </w:num>
   <w:num w:numId="17" w16cid:durableId="452099309">
     <w:abstractNumId w:val="5"/>
   </w:num>
   <w:num w:numId="18" w16cid:durableId="1799294945">
-    <w:abstractNumId w:val="33"/>
+    <w:abstractNumId w:val="35"/>
   </w:num>
   <w:num w:numId="19" w16cid:durableId="215052976">
     <w:abstractNumId w:val="22"/>
@@ -8716,7 +8968,7 @@
     <w:abstractNumId w:val="10"/>
   </w:num>
   <w:num w:numId="21" w16cid:durableId="469639761">
-    <w:abstractNumId w:val="31"/>
+    <w:abstractNumId w:val="33"/>
   </w:num>
   <w:num w:numId="22" w16cid:durableId="1036850050">
     <w:abstractNumId w:val="14"/>
@@ -8740,7 +8992,7 @@
     <w:abstractNumId w:val="17"/>
   </w:num>
   <w:num w:numId="29" w16cid:durableId="333845795">
-    <w:abstractNumId w:val="29"/>
+    <w:abstractNumId w:val="30"/>
   </w:num>
   <w:num w:numId="30" w16cid:durableId="107749214">
     <w:abstractNumId w:val="3"/>
@@ -8755,15 +9007,24 @@
     <w:abstractNumId w:val="20"/>
   </w:num>
   <w:num w:numId="34" w16cid:durableId="1531802390">
-    <w:abstractNumId w:val="30"/>
+    <w:abstractNumId w:val="31"/>
   </w:num>
   <w:num w:numId="35" w16cid:durableId="2021658826">
+    <w:abstractNumId w:val="29"/>
+  </w:num>
+  <w:num w:numId="36" w16cid:durableId="1577939576">
     <w:abstractNumId w:val="28"/>
   </w:num>
-  <w:num w:numId="36" w16cid:durableId="1577939576">
-    <w:abstractNumId w:val="27"/>
+  <w:num w:numId="37" w16cid:durableId="1136525657">
+    <w:abstractNumId w:val="34"/>
   </w:num>
-  <w:num w:numId="37" w16cid:durableId="1136525657">
+  <w:num w:numId="38" w16cid:durableId="1048912517">
+    <w:abstractNumId w:val="37"/>
+  </w:num>
+  <w:num w:numId="39" w16cid:durableId="1428042510">
+    <w:abstractNumId w:val="24"/>
+  </w:num>
+  <w:num w:numId="40" w16cid:durableId="874776289">
     <w:abstractNumId w:val="32"/>
   </w:num>
 </w:numbering>

</xml_diff>